<commit_message>
Hildesheim seminar rebuilt around Malta and Jamaica, 16 September 2026
</commit_message>
<xml_diff>
--- a/hildesheim-seminar-outline-27-november-2026.docx
+++ b/hildesheim-seminar-outline-27-november-2026.docx
@@ -31,7 +31,7 @@
           <w:color w:val="000000"/>
           <w:sz w:val="24"/>
         </w:rPr>
-        <w:t>Europe's small states as the first remittance economies, and what the islands of today show us</w:t>
+        <w:t>How small island states navigate economic dependency: Malta's twentieth century, and Jamaica's</w:t>
       </w:r>
     </w:p>
     <w:p>
@@ -76,7 +76,7 @@
           <w:i w:val="0"/>
           <w:color w:val="000000"/>
         </w:rPr>
-        <w:t>Small states in the twentieth century lived on money they did not make at home: rent for a strategic position, foreign aid, and the earnings of people who had left. Europe's own small states were the first economies to live on the two flows I study today. Malta received net official development assistance every year from 1960 to 2000, reaching 7.5 per cent of its national income in 1973, the year after Dom Mintoff negotiated 14 million pounds a year from Britain and its NATO allies for the use of the harbour. Portugal received remittances worth 9.3 per cent of its GDP in 1979, above the average for a small island state today. Both figures are sources: somebody counted something under rules that have a date, and the record says how much money arrived and not who decided what to do with it. The session teaches the two flows and the rules behind their numbers, puts Malta in 1972 and Tonga in 2026 side by side to ask who decided each flow, and then hands the students one figure each to read as a source and turn into a classroom exercise. It closes on the disagreement in the scholarship between reading dependence as something done to small states and reading the same records as bargaining, stated as a disagreement that a school textbook settles on every page without saying so.</w:t>
+        <w:t>Malta lived the twentieth century on money it did not make at home: the wages of a British naval dockyard, the passages the colonial government paid so that its people would leave, the money those emigrants sent back, and the rent that Britain and NATO paid for the harbour after 1972. The session tells that century in five moves, each with a date, a number and a decision: the fortress economy and the 1957 defence cuts that threatened it; emigration as policy, with more than 140,000 people gone on assisted passages after 1946; the 1956 referendum in which three voters in four chose to join Britain and Britain declined, so that independence in 1964 came on London's terms; the 1972 agreement in which Dom Mintoff set the price of the harbour, the only time in the century that Malta did; and the closure of the base in 1979. Three factors run through the moves: a home market too small to employ its own people, one dominant external partner, and a strategic position that could be priced. Jamaica, which left the same empire in 1962, shared the first two and lacked the third, and its century ran the other way: emigration to Britain until the door closed in the year of independence, remittances rising from 3 per cent of GDP in 1976 to 23 per cent in 2021, and in 2015 a British offer of a prison, built with aid money, in place of the reparations the Caribbean had asked for. The session closes on the sources: the archive kept the state's negotiations to the pound and the household's decisions not at all, which is why my project asks Jamaican households directly in 2027, and why a history of small states written only from the files is a history of what the large state decided.</w:t>
       </w:r>
     </w:p>
     <w:p>
@@ -111,7 +111,7 @@
           <w:rFonts w:ascii="Times New Roman" w:hAnsi="Times New Roman"/>
           <w:color w:val="000000"/>
         </w:rPr>
-        <w:t>Opening. Four bars on one screen: net aid to Malta in 1973, remittances to Portugal in 1979, and both flows to Tonga in 2023. The question for the session: the records say how much arrived, not who decided.</w:t>
+        <w:t>Opening. Two questions: what dependency meant in one dockyard of 12,000 workers, and who decided what a small island's money would be.</w:t>
       </w:r>
     </w:p>
     <w:p>
@@ -124,14 +124,14 @@
           <w:b/>
           <w:color w:val="000000"/>
         </w:rPr>
-        <w:t xml:space="preserve">12:20, twenty minutes. </w:t>
+        <w:t xml:space="preserve">12:20, twenty five minutes. </w:t>
       </w:r>
       <w:r>
         <w:rPr>
           <w:rFonts w:ascii="Times New Roman" w:hAnsi="Times New Roman"/>
           <w:color w:val="000000"/>
         </w:rPr>
-        <w:t>Two kinds of money and the rules behind the numbers. What counts as aid, a category the donor governments defined in 1969, and what counts as a remittance, a line in the balance of payments that misses cash carried home and parcels sent. The World Bank pages for Malta, Cyprus and Portugal are opened live, and the students read the shape of each line against the events they know: 1972, 1974, 1979, 1986.</w:t>
+        <w:t>Malta's century in five moves, one stop each, with the World Bank aid series opened live for 1970 to 1985 and the primary sources quoted on screen (Smith 2007, Fenech 1997, King 1979, the Kissinger memorandum of 11 March 1972).</w:t>
       </w:r>
     </w:p>
     <w:p>
@@ -144,14 +144,14 @@
           <w:b/>
           <w:color w:val="000000"/>
         </w:rPr>
-        <w:t xml:space="preserve">12:40, twenty minutes. </w:t>
+        <w:t xml:space="preserve">12:45, fifteen minutes. </w:t>
       </w:r>
       <w:r>
         <w:rPr>
           <w:rFonts w:ascii="Times New Roman" w:hAnsi="Times New Roman"/>
           <w:color w:val="000000"/>
         </w:rPr>
-        <w:t>Whose decision. Aid passes through five written decisions before it reaches a household; a remittance arrives with one named person and is written down nowhere. Malta in 1972 (the base agreement and the 140,000 emigrants) and Tonga in 2026 (aid at half the budget, remittances in nine households in ten, seasonal work schemes designed by the receiving governments of the workers) side by side, and the question FAR-SIDS now asks the households themselves.</w:t>
+        <w:t>Jamaica beside Malta: 1948 to 1962, the rise of remittances, the 2015 visit and the Windrush scandal; then what FAR-SIDS asks Jamaican households in 2027 and why that answers a question the Maltese archive cannot.</w:t>
       </w:r>
     </w:p>
     <w:p>
@@ -164,14 +164,14 @@
           <w:b/>
           <w:color w:val="000000"/>
         </w:rPr>
-        <w:t xml:space="preserve">13:00, twenty five minutes. </w:t>
+        <w:t xml:space="preserve">13:00, thirty six minutes. </w:t>
       </w:r>
       <w:r>
         <w:rPr>
           <w:rFonts w:ascii="Times New Roman" w:hAnsi="Times New Roman"/>
           <w:color w:val="000000"/>
         </w:rPr>
-        <w:t>Breakout in four rooms of about four students. Each room has one page, a figure with its rules (the four packs below). The group writes what the figure counts, who made the record and what it leaves out, and then the two questions it would put to a class of sixteen year olds, with the answer it would hope for.</w:t>
+        <w:t>The students teach. Four rooms of about four, twelve minutes to build a five minute lesson on one decision (Malta 1956, Malta 1972, Jamaica 1962, Jamaica 2015) from a one page source pack; then each room teaches its lesson to the rest of the group for four minutes, the group being the class and voting when asked; then six minutes on what the four lessons had in common.</w:t>
       </w:r>
     </w:p>
     <w:p>
@@ -184,27 +184,7 @@
           <w:b/>
           <w:color w:val="000000"/>
         </w:rPr>
-        <w:t xml:space="preserve">13:25, fifteen minutes. </w:t>
-      </w:r>
-      <w:r>
-        <w:rPr>
-          <w:rFonts w:ascii="Times New Roman" w:hAnsi="Times New Roman"/>
-          <w:color w:val="000000"/>
-        </w:rPr>
-        <w:t>Report back, two minutes a room, and the disagreement: Prebisch, Frank and the MIRAB model on one side, Fox, Katzenstein and Baldacchino on the other, with the four packs as the evidence both sides cite.</w:t>
-      </w:r>
-    </w:p>
-    <w:p>
-      <w:pPr>
-        <w:spacing w:after="100" w:line="264" w:lineRule="auto"/>
-      </w:pPr>
-      <w:r>
-        <w:rPr>
-          <w:rFonts w:ascii="Times New Roman" w:hAnsi="Times New Roman"/>
-          <w:b/>
-          <w:color w:val="000000"/>
-        </w:rPr>
-        <w:t xml:space="preserve">13:40, five minutes. </w:t>
+        <w:t xml:space="preserve">13:36, four minutes. </w:t>
       </w:r>
       <w:r>
         <w:rPr>
@@ -226,7 +206,36 @@
           <w:color w:val="000000"/>
           <w:sz w:val="26"/>
         </w:rPr>
-        <w:t>The four source packs (one page each, circulated the week before)</w:t>
+        <w:t>The lesson each room builds</w:t>
+      </w:r>
+    </w:p>
+    <w:p>
+      <w:pPr>
+        <w:spacing w:after="120" w:line="264" w:lineRule="auto"/>
+      </w:pPr>
+      <w:r>
+        <w:rPr>
+          <w:rFonts w:ascii="Times New Roman" w:hAnsi="Times New Roman"/>
+          <w:b w:val="0"/>
+          <w:i w:val="0"/>
+          <w:color w:val="000000"/>
+        </w:rPr>
+        <w:t>One source on the screen, in the words of the pack. One question the class must answer before it knows the outcome. A vote or a choice, made in role (Maltese voters in 1956, Mintoff in 1972, a Kingston family in 1962, the Jamaican cabinet in 2015). Then the reveal, and one sentence on what the decision tells us about being small. Every fact comes from the pack, which gives its sources with page numbers, so that when the class asks where a number comes from the teacher can say.</w:t>
+      </w:r>
+    </w:p>
+    <w:p>
+      <w:pPr>
+        <w:spacing w:after="80" w:line="264" w:lineRule="auto" w:before="200"/>
+      </w:pPr>
+      <w:r>
+        <w:rPr>
+          <w:rFonts w:ascii="Times New Roman" w:hAnsi="Times New Roman"/>
+          <w:b/>
+          <w:i w:val="0"/>
+          <w:color w:val="000000"/>
+          <w:sz w:val="26"/>
+        </w:rPr>
+        <w:t>Two alternative designs, if you prefer</w:t>
       </w:r>
     </w:p>
     <w:p>
@@ -239,14 +248,14 @@
           <w:b/>
           <w:color w:val="000000"/>
         </w:rPr>
-        <w:t xml:space="preserve">Pack A. </w:t>
+        <w:t xml:space="preserve">B, two archives. </w:t>
       </w:r>
       <w:r>
         <w:rPr>
           <w:rFonts w:ascii="Times New Roman" w:hAnsi="Times New Roman"/>
           <w:color w:val="000000"/>
         </w:rPr>
-        <w:t>Malta, net aid received as a share of national income, 1970 to 1985, one row per year from the World Bank series, with the 1972 defence agreement and the 1979 closure of the British base marked.</w:t>
+        <w:t>Each room receives a state document and a household document for the same moment and teaches the class who is speaking in each, who is missing, and which one a textbook would quote. Closer to a source seminar; better for a group that has already worked on source criticism.</w:t>
       </w:r>
     </w:p>
     <w:p>
@@ -259,54 +268,14 @@
           <w:b/>
           <w:color w:val="000000"/>
         </w:rPr>
-        <w:t xml:space="preserve">Pack B. </w:t>
+        <w:t xml:space="preserve">C, the letter home. </w:t>
       </w:r>
       <w:r>
         <w:rPr>
           <w:rFonts w:ascii="Times New Roman" w:hAnsi="Times New Roman"/>
           <w:color w:val="000000"/>
         </w:rPr>
-        <w:t>Portugal, remittances received as a share of GDP, 1975 to 1995, one row per year from the World Bank series, with the 1974 revolution and the 1986 accession to the European Community marked.</w:t>
-      </w:r>
-    </w:p>
-    <w:p>
-      <w:pPr>
-        <w:spacing w:after="100" w:line="264" w:lineRule="auto"/>
-      </w:pPr>
-      <w:r>
-        <w:rPr>
-          <w:rFonts w:ascii="Times New Roman" w:hAnsi="Times New Roman"/>
-          <w:b/>
-          <w:color w:val="000000"/>
-        </w:rPr>
-        <w:t xml:space="preserve">Pack C. </w:t>
-      </w:r>
-      <w:r>
-        <w:rPr>
-          <w:rFonts w:ascii="Times New Roman" w:hAnsi="Times New Roman"/>
-          <w:color w:val="000000"/>
-        </w:rPr>
-        <w:t>Tonga, one page of the 2021 Household Income and Expenditure Survey report: 90 in every 100 households received cash remittances in the last twelve months, 96 in 100 of those headed by a woman, and the share of the money from New Zealand, Australia and the United States.</w:t>
-      </w:r>
-    </w:p>
-    <w:p>
-      <w:pPr>
-        <w:spacing w:after="100" w:line="264" w:lineRule="auto"/>
-      </w:pPr>
-      <w:r>
-        <w:rPr>
-          <w:rFonts w:ascii="Times New Roman" w:hAnsi="Times New Roman"/>
-          <w:b/>
-          <w:color w:val="000000"/>
-        </w:rPr>
-        <w:t xml:space="preserve">Pack D. </w:t>
-      </w:r>
-      <w:r>
-        <w:rPr>
-          <w:rFonts w:ascii="Times New Roman" w:hAnsi="Times New Roman"/>
-          <w:color w:val="000000"/>
-        </w:rPr>
-        <w:t>The paragraph of the OECD casebook on migration (2023) that rules on New Zealand and Australian seasonal work schemes: the training attached to the scheme counts as aid, its running costs do not, and migrants sending money home does not make a programme aid.</w:t>
+        <w:t>Each room writes the letter that came with the money (Melbourne to Malta in 1972, Birmingham to Kingston in 1962, and so on) using only facts from the pack, then the class says which sentences a historian could verify. The most creative design and the one that makes the point about missing voices most directly; for a confident group.</w:t>
       </w:r>
     </w:p>
     <w:p>
@@ -335,7 +304,7 @@
           <w:i w:val="0"/>
           <w:color w:val="000000"/>
         </w:rPr>
-        <w:t>Breakout rooms for four groups at 13:00, the four packs sent to the students in the week before with the note that no preparation beyond reading their page is needed, and a shared screen or document on which I can write the groups' questions as they report. No prior knowledge of development economics is assumed; every term is explained on first use in the session itself.</w:t>
+        <w:t>Four breakout rooms at 13:00, the four one page packs sent to the students in the week before, and a shared screen or document. No prior knowledge of Malta, Jamaica or development economics is assumed; every term is explained in the session. I would be glad to know before the session whether the group has done source criticism in your opening weeks, because that decides between design A and design B.</w:t>
       </w:r>
     </w:p>
     <w:p>
@@ -364,7 +333,7 @@
           <w:i w:val="0"/>
           <w:color w:val="000000"/>
         </w:rPr>
-        <w:t xml:space="preserve">Bertram, G. and Watters, R. F. (1985) The MIRAB economy in South Pacific microstates. Pacific Viewpoint, 26(3), 497 to 519. </w:t>
+        <w:t xml:space="preserve">Smith, S. C. (2007) Integration and disintegration: the attempted incorporation of Malta into the United Kingdom in the 1950s. Journal of Imperial and Commonwealth History, 35(1), 49 to 71. Open access from the University of Malta library. </w:t>
       </w:r>
       <w:hyperlink r:id="rId9">
         <w:r>
@@ -372,7 +341,7 @@
             <w:u w:val="single"/>
             <w:rFonts w:ascii="Times New Roman" w:hAnsi="Times New Roman"/>
           </w:rPr>
-          <w:t xml:space="preserve">https://doi.org/10.1111/apv.263002</w:t>
+          <w:t xml:space="preserve">https://doi.org/10.1080/03086530601143396</w:t>
         </w:r>
       </w:hyperlink>
     </w:p>
@@ -387,21 +356,7 @@
           <w:i w:val="0"/>
           <w:color w:val="000000"/>
         </w:rPr>
-        <w:t>Katzenstein, P. J. (1985) Small States in World Markets: industrial policy in Europe. Ithaca: Cornell University Press. Chapter 1.</w:t>
-      </w:r>
-    </w:p>
-    <w:p>
-      <w:pPr>
-        <w:spacing w:after="60" w:line="264" w:lineRule="auto"/>
-      </w:pPr>
-      <w:r>
-        <w:rPr>
-          <w:rFonts w:ascii="Times New Roman" w:hAnsi="Times New Roman"/>
-          <w:b w:val="0"/>
-          <w:i w:val="0"/>
-          <w:color w:val="000000"/>
-        </w:rPr>
-        <w:t xml:space="preserve">Malifa, E. and others (eds) (2026) The State of SIDS Report 2026: defending the special case. London: ODI Global. Summary for policy-makers, pages 3 to 13. </w:t>
+        <w:t xml:space="preserve">Fenech, D. (1997) Malta's external security. GeoJournal, 41(2), 153 to 163. </w:t>
       </w:r>
       <w:hyperlink r:id="rId10">
         <w:r>
@@ -409,7 +364,7 @@
             <w:u w:val="single"/>
             <w:rFonts w:ascii="Times New Roman" w:hAnsi="Times New Roman"/>
           </w:rPr>
-          <w:t xml:space="preserve">https://odi.org/en/publications/the-state-of-sids-report-2026-defending-the-special-case/</w:t>
+          <w:t xml:space="preserve">https://doi.org/10.1023/A:1006888926016</w:t>
         </w:r>
       </w:hyperlink>
     </w:p>
@@ -424,7 +379,7 @@
           <w:i w:val="0"/>
           <w:color w:val="000000"/>
         </w:rPr>
-        <w:t xml:space="preserve">World Bank, net ODA received as a share of GNI, and personal remittances received as a share of GDP, any country. </w:t>
+        <w:t xml:space="preserve">King, R. (1979) The Maltese migration cycle: an archival survey. Area, 11(3), 245 to 249. </w:t>
       </w:r>
       <w:hyperlink r:id="rId11">
         <w:r>
@@ -432,11 +387,22 @@
             <w:u w:val="single"/>
             <w:rFonts w:ascii="Times New Roman" w:hAnsi="Times New Roman"/>
           </w:rPr>
-          <w:t xml:space="preserve">https://data.worldbank.org/indicator/DT.ODA.ODAT.GN.ZS</w:t>
+          <w:t xml:space="preserve">https://www.jstor.org/stable/20001477</w:t>
         </w:r>
       </w:hyperlink>
+    </w:p>
+    <w:p>
+      <w:pPr>
+        <w:spacing w:after="60" w:line="264" w:lineRule="auto"/>
+      </w:pPr>
       <w:r>
-        <w:t xml:space="preserve"> and </w:t>
+        <w:rPr>
+          <w:rFonts w:ascii="Times New Roman" w:hAnsi="Times New Roman"/>
+          <w:b w:val="0"/>
+          <w:i w:val="0"/>
+          <w:color w:val="000000"/>
+        </w:rPr>
+        <w:t xml:space="preserve">Hansen, R. (2000) Citizenship and Immigration in Post-war Britain. Oxford: Oxford University Press. </w:t>
       </w:r>
       <w:hyperlink r:id="rId12">
         <w:r>
@@ -444,7 +410,67 @@
             <w:u w:val="single"/>
             <w:rFonts w:ascii="Times New Roman" w:hAnsi="Times New Roman"/>
           </w:rPr>
-          <w:t xml:space="preserve">https://data.worldbank.org/indicator/BX.TRF.PWKR.DT.GD.ZS</w:t>
+          <w:t xml:space="preserve">https://doi.org/10.1093/oso/9780198297093.001.0001</w:t>
+        </w:r>
+      </w:hyperlink>
+    </w:p>
+    <w:p>
+      <w:pPr>
+        <w:spacing w:after="60" w:line="264" w:lineRule="auto"/>
+      </w:pPr>
+      <w:r>
+        <w:rPr>
+          <w:rFonts w:ascii="Times New Roman" w:hAnsi="Times New Roman"/>
+          <w:b w:val="0"/>
+          <w:i w:val="0"/>
+          <w:color w:val="000000"/>
+        </w:rPr>
+        <w:t xml:space="preserve">Thomas-Hope, E. (1999) Return migration to Jamaica and its development potential. International Migration, 37(1), 183 to 207. </w:t>
+      </w:r>
+      <w:hyperlink r:id="rId13">
+        <w:r>
+          <w:rPr>
+            <w:u w:val="single"/>
+            <w:rFonts w:ascii="Times New Roman" w:hAnsi="Times New Roman"/>
+          </w:rPr>
+          <w:t xml:space="preserve">https://doi.org/10.1111/1468-2435.00070</w:t>
+        </w:r>
+      </w:hyperlink>
+    </w:p>
+    <w:p>
+      <w:pPr>
+        <w:spacing w:after="60" w:line="264" w:lineRule="auto"/>
+      </w:pPr>
+      <w:r>
+        <w:rPr>
+          <w:rFonts w:ascii="Times New Roman" w:hAnsi="Times New Roman"/>
+          <w:b w:val="0"/>
+          <w:i w:val="0"/>
+          <w:color w:val="000000"/>
+        </w:rPr>
+        <w:t>Beckles, H. McD. (2013) Britain's Black Debt: reparations for Caribbean slavery and native genocide. Kingston: University of the West Indies Press.</w:t>
+      </w:r>
+    </w:p>
+    <w:p>
+      <w:pPr>
+        <w:spacing w:after="60" w:line="264" w:lineRule="auto"/>
+      </w:pPr>
+      <w:r>
+        <w:rPr>
+          <w:rFonts w:ascii="Times New Roman" w:hAnsi="Times New Roman"/>
+          <w:b w:val="0"/>
+          <w:i w:val="0"/>
+          <w:color w:val="000000"/>
+        </w:rPr>
+        <w:t xml:space="preserve">Baldacchino, G. (2006) Managing the hinterland beyond: two ideal-type strategies of economic development for small island territories. Asia Pacific Viewpoint, 47(1), 45 to 60. </w:t>
+      </w:r>
+      <w:hyperlink r:id="rId14">
+        <w:r>
+          <w:rPr>
+            <w:u w:val="single"/>
+            <w:rFonts w:ascii="Times New Roman" w:hAnsi="Times New Roman"/>
+          </w:rPr>
+          <w:t xml:space="preserve">https://doi.org/10.1111/j.1467-8373.2006.00295.x</w:t>
         </w:r>
       </w:hyperlink>
     </w:p>

</xml_diff>

<commit_message>
17 Sep 2026: new Hildesheim seminar title and five sections wording
</commit_message>
<xml_diff>
--- a/hildesheim-seminar-outline-27-november-2026.docx
+++ b/hildesheim-seminar-outline-27-november-2026.docx
@@ -15,7 +15,7 @@
           <w:color w:val="000000"/>
           <w:sz w:val="32"/>
         </w:rPr>
-        <w:t>Aid, remittances and agency</w:t>
+        <w:t>Aid, remittances and agency in small island states</w:t>
       </w:r>
     </w:p>
     <w:p>
@@ -31,7 +31,7 @@
           <w:color w:val="000000"/>
           <w:sz w:val="24"/>
         </w:rPr>
-        <w:t>How small island states navigate economic dependency: Malta's twentieth century, and Jamaica's</w:t>
+        <w:t>The cases of Malta and Jamaica</w:t>
       </w:r>
     </w:p>
     <w:p>
@@ -76,7 +76,7 @@
           <w:i w:val="0"/>
           <w:color w:val="000000"/>
         </w:rPr>
-        <w:t>Malta lived the twentieth century on money it did not make at home: the wages of a British naval dockyard, the passages the colonial government paid so that its people would leave, the money those emigrants sent back, and the rent that Britain and NATO paid for the harbour after 1972. The session tells that century in five moves, each with a date, a number and a decision: the fortress economy and the 1957 defence cuts that threatened it; emigration as policy, with more than 140,000 people gone on assisted passages after 1946; the 1956 referendum in which three voters in four chose to join Britain and Britain declined, so that independence in 1964 came on London's terms; the 1972 agreement in which Dom Mintoff set the price of the harbour, the only time in the century that Malta did; and the closure of the base in 1979. Three factors run through the moves: a home market too small to employ its own people, one dominant external partner, and a strategic position that could be priced. Jamaica, which left the same empire in 1962, shared the first two and lacked the third, and its century ran the other way: emigration to Britain until the door closed in the year of independence, remittances worth the same share of GDP as Malta's in 1979 (about 3 per cent) and rising to 23 per cent in 2021 and 16 per cent in 2024, while Malta's fell to almost nothing, and in 2015 a British offer of a prison, built with aid money, in place of the reparations the Caribbean had asked for. The session closes on the sources: the archive kept the state's negotiations to the pound and the household's decisions not at all, which is why my project asks Jamaican households directly in 2027, and why a history of small states written only from the files is a history of what the large state decided.</w:t>
+        <w:t>Malta lived the twentieth century on money it did not make at home: the wages of a British naval dockyard, the passages the colonial government paid so that its people would leave, the money those emigrants sent back, and the rent that Britain and NATO paid for the harbour after 1972. I tell that century in five sections, each with a date, a number and a decision: the fortress economy and the 1957 defence cuts that threatened it; emigration as policy, with more than 140,000 people gone on assisted passages after 1946; the 1956 referendum in which three voters in four chose to join Britain and Britain declined, so that independence in 1964 came on London's terms; the 1972 agreement in which Dom Mintoff set the price of the harbour, the only time in the century that Malta did; and the closure of the base in 1979. Three factors appear in all five sections: a home market too small to employ its own people, one dominant external partner, and a strategic position that could be priced. Jamaica, which left the same empire in 1962, shared the first two and lacked the third, and its century ran the other way: emigration to Britain until the door closed in the year of independence, remittances worth the same share of GDP as Malta's in 1979 (about 3 per cent) and rising to 23 per cent in 2021 and 16 per cent in 2024, while Malta's fell to almost nothing, and in 2015 a British offer of a prison, built with aid money, in place of the reparations the Caribbean had asked for. The session closes on the sources: the archive kept the state's negotiations to the pound and the household's decisions not at all, which is why my project asks Jamaican households directly in 2027, and why a history of small states written only from the files is a history of what the large state decided.</w:t>
       </w:r>
     </w:p>
     <w:p>
@@ -131,7 +131,7 @@
           <w:rFonts w:ascii="Times New Roman" w:hAnsi="Times New Roman"/>
           <w:color w:val="000000"/>
         </w:rPr>
-        <w:t>Malta's century in five moves, one stop each, with the World Bank aid series opened live for 1970 to 1985 and the primary sources quoted on screen (Smith 2007, Fenech 1997, King 1979, the Kissinger memorandum of 11 March 1972).</w:t>
+        <w:t>Malta's century in five sections, one stop each, with the World Bank aid series opened live for 1970 to 1985 and the primary sources quoted on screen (Smith 2007, Fenech 1997, King 1979, the Kissinger memorandum of 11 March 1972).</w:t>
       </w:r>
     </w:p>
     <w:p>

</xml_diff>

<commit_message>
17 Sep 2026: Hildesheim seminar rebuilt, German debate, fact sheets
</commit_message>
<xml_diff>
--- a/hildesheim-seminar-outline-27-november-2026.docx
+++ b/hildesheim-seminar-outline-27-november-2026.docx
@@ -9,29 +9,31 @@
       </w:pPr>
       <w:r>
         <w:rPr>
-          <w:rFonts w:ascii="Times New Roman" w:hAnsi="Times New Roman"/>
+          <w:rFonts w:ascii="Times New Roman" w:hAnsi="Times New Roman" w:cs="Times New Roman"/>
           <w:b/>
           <w:i w:val="0"/>
           <w:color w:val="000000"/>
           <w:sz w:val="32"/>
+          <w:szCs w:val="32"/>
         </w:rPr>
-        <w:t>Aid, remittances and agency in small island states</w:t>
+        <w:t xml:space="preserve">Aid, remittances and agency in small island states</w:t>
       </w:r>
     </w:p>
     <w:p>
       <w:pPr>
-        <w:spacing w:after="40" w:line="264" w:lineRule="auto"/>
+        <w:spacing w:after="120" w:line="264" w:lineRule="auto"/>
         <w:jc w:val="center"/>
       </w:pPr>
       <w:r>
         <w:rPr>
-          <w:rFonts w:ascii="Times New Roman" w:hAnsi="Times New Roman"/>
+          <w:rFonts w:ascii="Times New Roman" w:hAnsi="Times New Roman" w:cs="Times New Roman"/>
           <w:b w:val="0"/>
           <w:i/>
           <w:color w:val="000000"/>
           <w:sz w:val="24"/>
+          <w:szCs w:val="24"/>
         </w:rPr>
-        <w:t>The cases of Malta and Jamaica</w:t>
+        <w:t xml:space="preserve">The cases of Malta and Jamaica</w:t>
       </w:r>
     </w:p>
     <w:p>
@@ -41,28 +43,31 @@
       </w:pPr>
       <w:r>
         <w:rPr>
-          <w:rFonts w:ascii="Times New Roman" w:hAnsi="Times New Roman"/>
+          <w:rFonts w:ascii="Times New Roman" w:hAnsi="Times New Roman" w:cs="Times New Roman"/>
           <w:b w:val="0"/>
           <w:i w:val="0"/>
           <w:color w:val="000000"/>
           <w:sz w:val="21"/>
+          <w:szCs w:val="21"/>
         </w:rPr>
-        <w:t>Seminar session for European Small States in the 20th Century, University of Hildesheim. Friday 27 November 2026, 12:15 to 13:45 CET, online. Dr Roxane de Waegh, Islands and Small States Institute, University of Malta. Outline of 16 September 2026.</w:t>
+        <w:t xml:space="preserve">Seminar session for European Small States in the 20th Century, University of Hildesheim. Friday 27 November 2026, 12:15 to 13:45 CET, online. Dr Roxane de Waegh, Islands and Small States Institute, University of Malta. Outline of 17 September 2026.</w:t>
       </w:r>
     </w:p>
     <w:p>
       <w:pPr>
         <w:spacing w:after="80" w:line="264" w:lineRule="auto" w:before="200"/>
+        <w:keepNext/>
       </w:pPr>
       <w:r>
         <w:rPr>
-          <w:rFonts w:ascii="Times New Roman" w:hAnsi="Times New Roman"/>
+          <w:rFonts w:ascii="Times New Roman" w:hAnsi="Times New Roman" w:cs="Times New Roman"/>
           <w:b/>
           <w:i w:val="0"/>
           <w:color w:val="000000"/>
           <w:sz w:val="26"/>
+          <w:szCs w:val="26"/>
         </w:rPr>
-        <w:t>What the session argues</w:t>
+        <w:t xml:space="preserve">What the session asks</w:t>
       </w:r>
     </w:p>
     <w:p>
@@ -71,27 +76,43 @@
       </w:pPr>
       <w:r>
         <w:rPr>
-          <w:rFonts w:ascii="Times New Roman" w:hAnsi="Times New Roman"/>
+          <w:rFonts w:ascii="Times New Roman" w:hAnsi="Times New Roman" w:cs="Times New Roman"/>
           <w:b w:val="0"/>
           <w:i w:val="0"/>
           <w:color w:val="000000"/>
         </w:rPr>
-        <w:t>Malta lived the twentieth century on money it did not make at home: the wages of a British naval dockyard, the passages the colonial government paid so that its people would leave, the money those emigrants sent back, and the rent that Britain and NATO paid for the harbour after 1972. I tell that century in five sections, each with a date, a number and a decision: the fortress economy and the 1957 defence cuts that threatened it; emigration as policy, with more than 140,000 people gone on assisted passages after 1946; the 1956 referendum in which three voters in four chose to join Britain and Britain declined, so that independence in 1964 came on London's terms; the 1972 agreement in which Dom Mintoff set the price of the harbour, the only time in the century that Malta did; and the closure of the base in 1979. Three factors appear in all five sections: a home market too small to employ its own people, one dominant external partner, and a strategic position that could be priced. Jamaica, which left the same empire in 1962, shared the first two and lacked the third, and its century ran the other way: emigration to Britain until the door closed in the year of independence, remittances worth the same share of GDP as Malta's in 1979 (about 3 per cent) and rising to 23 per cent in 2021 and 16 per cent in 2024, while Malta's fell to almost nothing, and in 2015 a British offer of a prison, built with aid money, in place of the reparations the Caribbean had asked for. The session closes on the sources: the archive kept the state's negotiations to the pound and the household's decisions not at all, which is why my project asks Jamaican households directly in 2027, and why a history of small states written only from the files is a history of what the large state decided.</w:t>
+        <w:t xml:space="preserve">The session asks one question: when a small island lives on money from outside, how much agency do its government and its families have, meaning how far can they make their own decisions when a larger power sets most of the terms? I answer it through Malta, a small European state that depended on British money for most of the twentieth century, and I take the students through that century in five stages, asking in each who made the decision. Up to 1957 most Maltese worked for the British forces, about 12,000 of them in the naval dockyard alone, so the British government decided how many Maltese had jobs and what they earned. After 1946 the colonial government paid more than 140,000 people to emigrate because the island had too few jobs, and the emigrants then decided for themselves how much money to send home. In 1956 three Maltese voters in four chose to join Britain, the British government refused, and Malta became independent in 1964 on terms that London set. In 1971 Prime Minister Dom Mintoff told Britain that it would now pay rent for the harbour it had used since 1800, and in March 1972 Britain and its NATO allies signed a seven year agreement to pay 14 million pounds a year, more than three times the old rent, which is the clearest case of agency in the century. After the British base closed in 1979, Maltese governments built a new economy through tourism, manufacturing and, from 2004, membership of the European Union. The fifth stage asks what the records let a historian see: officials wrote down every sum they negotiated, while almost nobody wrote down what families decided.</w:t>
+      </w:r>
+    </w:p>
+    <w:p>
+      <w:pPr>
+        <w:spacing w:after="120" w:line="264" w:lineRule="auto"/>
+      </w:pPr>
+      <w:r>
+        <w:rPr>
+          <w:rFonts w:ascii="Times New Roman" w:hAnsi="Times New Roman" w:cs="Times New Roman"/>
+          <w:b w:val="0"/>
+          <w:i w:val="0"/>
+          <w:color w:val="000000"/>
+        </w:rPr>
+        <w:t xml:space="preserve">Jamaica, which left the same empire in 1962, shows where the decisions moved. Jamaicans moved to Britain for work from 1948 until the Commonwealth Immigrants Act restricted entry on 1 July 1962, and then turned mainly to the United States and Canada. In 1976, the first year for which the World Bank has figures for both islands, money sent home by emigrants (remittances) was worth 6.1% of Malta's GDP and 3.0% of Jamaica's. The two islands then went in opposite directions: remittances fell to 0.5% of Malta's GDP by 1999 as its economy grew, and rose to 8.7% of Jamaica's GDP by 1999 and to 16% by 2024, because Jamaica's economy did not create enough work and Jamaicans kept leaving. The Jamaican government still negotiates much of the island's income from abroad, but a large share now also arrives as private transfers to households, which the government does not direct. From the comparison the students take three conditions they can test on any small state in the course: a home market too small to employ its people, dependence on one larger country, and whether the state holds something a larger country needs and whether its government can make that country pay for it.</w:t>
       </w:r>
     </w:p>
     <w:p>
       <w:pPr>
         <w:spacing w:after="80" w:line="264" w:lineRule="auto" w:before="200"/>
+        <w:keepNext/>
       </w:pPr>
       <w:r>
         <w:rPr>
-          <w:rFonts w:ascii="Times New Roman" w:hAnsi="Times New Roman"/>
+          <w:rFonts w:ascii="Times New Roman" w:hAnsi="Times New Roman" w:cs="Times New Roman"/>
           <w:b/>
           <w:i w:val="0"/>
           <w:color w:val="000000"/>
           <w:sz w:val="26"/>
+          <w:szCs w:val="26"/>
         </w:rPr>
-        <w:t>How the ninety minutes run</w:t>
+        <w:t xml:space="preserve">How the ninety minutes run</w:t>
       </w:r>
     </w:p>
     <w:p>
@@ -100,18 +121,21 @@
       </w:pPr>
       <w:r>
         <w:rPr>
-          <w:rFonts w:ascii="Times New Roman" w:hAnsi="Times New Roman"/>
+          <w:rFonts w:ascii="Times New Roman" w:hAnsi="Times New Roman" w:cs="Times New Roman"/>
           <w:b/>
+          <w:i w:val="0"/>
           <w:color w:val="000000"/>
         </w:rPr>
         <w:t xml:space="preserve">12:15, five minutes. </w:t>
       </w:r>
       <w:r>
         <w:rPr>
-          <w:rFonts w:ascii="Times New Roman" w:hAnsi="Times New Roman"/>
+          <w:rFonts w:ascii="Times New Roman" w:hAnsi="Times New Roman" w:cs="Times New Roman"/>
+          <w:b w:val="0"/>
+          <w:i w:val="0"/>
           <w:color w:val="000000"/>
         </w:rPr>
-        <w:t>Opening. Two questions: what dependency meant in one dockyard of 12,000 workers, and who decided what a small island's money would be.</w:t>
+        <w:t xml:space="preserve">Opening. The question for the session and what agency means for today.</w:t>
       </w:r>
     </w:p>
     <w:p>
@@ -120,18 +144,21 @@
       </w:pPr>
       <w:r>
         <w:rPr>
-          <w:rFonts w:ascii="Times New Roman" w:hAnsi="Times New Roman"/>
+          <w:rFonts w:ascii="Times New Roman" w:hAnsi="Times New Roman" w:cs="Times New Roman"/>
           <w:b/>
+          <w:i w:val="0"/>
           <w:color w:val="000000"/>
         </w:rPr>
         <w:t xml:space="preserve">12:20, twenty five minutes. </w:t>
       </w:r>
       <w:r>
         <w:rPr>
-          <w:rFonts w:ascii="Times New Roman" w:hAnsi="Times New Roman"/>
+          <w:rFonts w:ascii="Times New Roman" w:hAnsi="Times New Roman" w:cs="Times New Roman"/>
+          <w:b w:val="0"/>
+          <w:i w:val="0"/>
           <w:color w:val="000000"/>
         </w:rPr>
-        <w:t>Malta's century in five sections, one stop each, with the World Bank aid series opened live for 1970 to 1985 and the primary sources quoted on screen (Smith 2007, Fenech 1997, King 1979, the Kissinger memorandum of 11 March 1972).</w:t>
+        <w:t xml:space="preserve">Malta in five stages, one stop each, with the World Bank aid series for 1970 to 1985 and the primary sources quoted on screen (Smith 2007, Fenech 1997, King 1979, the Kissinger memorandum of 11 March 1972).</w:t>
       </w:r>
     </w:p>
     <w:p>
@@ -140,18 +167,21 @@
       </w:pPr>
       <w:r>
         <w:rPr>
-          <w:rFonts w:ascii="Times New Roman" w:hAnsi="Times New Roman"/>
+          <w:rFonts w:ascii="Times New Roman" w:hAnsi="Times New Roman" w:cs="Times New Roman"/>
           <w:b/>
+          <w:i w:val="0"/>
           <w:color w:val="000000"/>
         </w:rPr>
-        <w:t xml:space="preserve">12:45, fifteen minutes. </w:t>
+        <w:t xml:space="preserve">12:45, twelve minutes. </w:t>
       </w:r>
       <w:r>
         <w:rPr>
-          <w:rFonts w:ascii="Times New Roman" w:hAnsi="Times New Roman"/>
+          <w:rFonts w:ascii="Times New Roman" w:hAnsi="Times New Roman" w:cs="Times New Roman"/>
+          <w:b w:val="0"/>
+          <w:i w:val="0"/>
           <w:color w:val="000000"/>
         </w:rPr>
-        <w:t>Jamaica beside Malta: 1948 to 1962, the rise of remittances, the 2015 visit and the Windrush scandal; then what FAR-SIDS asks Jamaican households in 2027 and why that answers a question the Maltese archive cannot.</w:t>
+        <w:t xml:space="preserve">Jamaica beside Malta: migration to Britain and then North America, and the remittance series for both islands from 1976 to 2024. The stop ends with a short discussion: is a country better off when its money from abroad goes to the government, or straight to families?</w:t>
       </w:r>
     </w:p>
     <w:p>
@@ -160,18 +190,21 @@
       </w:pPr>
       <w:r>
         <w:rPr>
-          <w:rFonts w:ascii="Times New Roman" w:hAnsi="Times New Roman"/>
+          <w:rFonts w:ascii="Times New Roman" w:hAnsi="Times New Roman" w:cs="Times New Roman"/>
           <w:b/>
+          <w:i w:val="0"/>
           <w:color w:val="000000"/>
         </w:rPr>
-        <w:t xml:space="preserve">13:00, thirty six minutes. </w:t>
+        <w:t xml:space="preserve">12:57, forty two minutes. </w:t>
       </w:r>
       <w:r>
         <w:rPr>
-          <w:rFonts w:ascii="Times New Roman" w:hAnsi="Times New Roman"/>
+          <w:rFonts w:ascii="Times New Roman" w:hAnsi="Times New Roman" w:cs="Times New Roman"/>
+          <w:b w:val="0"/>
+          <w:i w:val="0"/>
           <w:color w:val="000000"/>
         </w:rPr>
-        <w:t>The students teach. Four rooms of about four, twelve minutes to build a five minute lesson on one decision (Malta 1956, Malta 1972, Jamaica 1962, Jamaica 2015) from a one page source pack; then each room teaches its lesson to the rest of the group for four minutes, the group being the class and voting when asked; then six minutes on what the four lessons had in common.</w:t>
+        <w:t xml:space="preserve">The debate about Germany, set out below: three minutes to set it up, twelve minutes in three groups, ten minutes of whole class debate, ten minutes on why the same arrangement means something different for a small state, and seven minutes on teaching this history in German schools.</w:t>
       </w:r>
     </w:p>
     <w:p>
@@ -180,33 +213,38 @@
       </w:pPr>
       <w:r>
         <w:rPr>
-          <w:rFonts w:ascii="Times New Roman" w:hAnsi="Times New Roman"/>
+          <w:rFonts w:ascii="Times New Roman" w:hAnsi="Times New Roman" w:cs="Times New Roman"/>
           <w:b/>
+          <w:i w:val="0"/>
           <w:color w:val="000000"/>
         </w:rPr>
-        <w:t xml:space="preserve">13:36, four minutes. </w:t>
+        <w:t xml:space="preserve">13:39, six minutes. </w:t>
       </w:r>
       <w:r>
         <w:rPr>
-          <w:rFonts w:ascii="Times New Roman" w:hAnsi="Times New Roman"/>
+          <w:rFonts w:ascii="Times New Roman" w:hAnsi="Times New Roman" w:cs="Times New Roman"/>
+          <w:b w:val="0"/>
+          <w:i w:val="0"/>
           <w:color w:val="000000"/>
         </w:rPr>
-        <w:t>Close. One sentence, three readings, contact details.</w:t>
+        <w:t xml:space="preserve">Close. One sentence, readings and contact details.</w:t>
       </w:r>
     </w:p>
     <w:p>
       <w:pPr>
         <w:spacing w:after="80" w:line="264" w:lineRule="auto" w:before="200"/>
+        <w:keepNext/>
       </w:pPr>
       <w:r>
         <w:rPr>
-          <w:rFonts w:ascii="Times New Roman" w:hAnsi="Times New Roman"/>
+          <w:rFonts w:ascii="Times New Roman" w:hAnsi="Times New Roman" w:cs="Times New Roman"/>
           <w:b/>
           <w:i w:val="0"/>
           <w:color w:val="000000"/>
           <w:sz w:val="26"/>
+          <w:szCs w:val="26"/>
         </w:rPr>
-        <w:t>The lesson each room builds</w:t>
+        <w:t xml:space="preserve">The debate</w:t>
       </w:r>
     </w:p>
     <w:p>
@@ -215,27 +253,12 @@
       </w:pPr>
       <w:r>
         <w:rPr>
-          <w:rFonts w:ascii="Times New Roman" w:hAnsi="Times New Roman"/>
+          <w:rFonts w:ascii="Times New Roman" w:hAnsi="Times New Roman" w:cs="Times New Roman"/>
           <w:b w:val="0"/>
           <w:i w:val="0"/>
           <w:color w:val="000000"/>
         </w:rPr>
-        <w:t>One source on the screen, in the words of the pack. One question the class must answer before it knows the outcome. A vote or a choice, made in role (Maltese voters in 1956, Mintoff in 1972, a Kingston family in 1962, the Jamaican cabinet in 2015). Then the reveal, and one sentence on what the decision tells us about being small. Every fact comes from the pack, which gives its sources with page numbers, so that when the class asks where a number comes from the teacher can say.</w:t>
-      </w:r>
-    </w:p>
-    <w:p>
-      <w:pPr>
-        <w:spacing w:after="80" w:line="264" w:lineRule="auto" w:before="200"/>
-      </w:pPr>
-      <w:r>
-        <w:rPr>
-          <w:rFonts w:ascii="Times New Roman" w:hAnsi="Times New Roman"/>
-          <w:b/>
-          <w:i w:val="0"/>
-          <w:color w:val="000000"/>
-          <w:sz w:val="26"/>
-        </w:rPr>
-        <w:t>Two alternative designs, if you prefer</w:t>
+        <w:t xml:space="preserve">Since most of the students are training to be history teachers, the last part of the session turns the seminar's question to their own country. Between 1955 and 1968 West Germany signed agreements to recruit workers from Italy, Spain, Greece, Turkey, Morocco, Portugal, Tunisia and Yugoslavia, and about 14 million people came to work before the federal government stopped recruitment on 23 November 1973, of whom just over 11 million went home again. The question is: who benefited more, the receiving country or the sending countries, and who decided the terms?</w:t>
       </w:r>
     </w:p>
     <w:p>
@@ -244,18 +267,21 @@
       </w:pPr>
       <w:r>
         <w:rPr>
-          <w:rFonts w:ascii="Times New Roman" w:hAnsi="Times New Roman"/>
+          <w:rFonts w:ascii="Times New Roman" w:hAnsi="Times New Roman" w:cs="Times New Roman"/>
           <w:b/>
+          <w:i w:val="0"/>
           <w:color w:val="000000"/>
         </w:rPr>
-        <w:t xml:space="preserve">B, two archives. </w:t>
+        <w:t xml:space="preserve">Group 1, West Germany. </w:t>
       </w:r>
       <w:r>
         <w:rPr>
-          <w:rFonts w:ascii="Times New Roman" w:hAnsi="Times New Roman"/>
+          <w:rFonts w:ascii="Times New Roman" w:hAnsi="Times New Roman" w:cs="Times New Roman"/>
+          <w:b w:val="0"/>
+          <w:i w:val="0"/>
           <w:color w:val="000000"/>
         </w:rPr>
-        <w:t>Each room receives a state document and a household document for the same moment and teaches the class who is speaking in each, who is missing, and which one a textbook would quote. Closer to a source seminar; better for a group that has already worked on source criticism.</w:t>
+        <w:t xml:space="preserve">A fact sheet on why the Federal Republic recruited workers and how it ended recruitment in 1973.</w:t>
       </w:r>
     </w:p>
     <w:p>
@@ -264,33 +290,44 @@
       </w:pPr>
       <w:r>
         <w:rPr>
-          <w:rFonts w:ascii="Times New Roman" w:hAnsi="Times New Roman"/>
+          <w:rFonts w:ascii="Times New Roman" w:hAnsi="Times New Roman" w:cs="Times New Roman"/>
           <w:b/>
+          <w:i w:val="0"/>
           <w:color w:val="000000"/>
         </w:rPr>
-        <w:t xml:space="preserve">C, the letter home. </w:t>
+        <w:t xml:space="preserve">Group 2, the sending governments. </w:t>
       </w:r>
       <w:r>
         <w:rPr>
-          <w:rFonts w:ascii="Times New Roman" w:hAnsi="Times New Roman"/>
+          <w:rFonts w:ascii="Times New Roman" w:hAnsi="Times New Roman" w:cs="Times New Roman"/>
+          <w:b w:val="0"/>
+          <w:i w:val="0"/>
           <w:color w:val="000000"/>
         </w:rPr>
-        <w:t>Each room writes the letter that came with the money (Melbourne to Malta in 1972, Birmingham to Kingston in 1962, and so on) using only facts from the pack, then the class says which sentences a historian could verify. The most creative design and the one that makes the point about missing voices most directly; for a confident group.</w:t>
+        <w:t xml:space="preserve">A fact sheet on Turkey: underemployment at home, about 867,000 workers recruited between 1961 and 1973, and the 2.1 billion Deutschmarks they sent home in 1972.</w:t>
       </w:r>
     </w:p>
     <w:p>
       <w:pPr>
-        <w:spacing w:after="80" w:line="264" w:lineRule="auto" w:before="200"/>
+        <w:spacing w:after="100" w:line="264" w:lineRule="auto"/>
       </w:pPr>
       <w:r>
         <w:rPr>
-          <w:rFonts w:ascii="Times New Roman" w:hAnsi="Times New Roman"/>
+          <w:rFonts w:ascii="Times New Roman" w:hAnsi="Times New Roman" w:cs="Times New Roman"/>
           <w:b/>
           <w:i w:val="0"/>
           <w:color w:val="000000"/>
-          <w:sz w:val="26"/>
         </w:rPr>
-        <w:t>What I would ask of you</w:t>
+        <w:t xml:space="preserve">Group 3, the families. </w:t>
+      </w:r>
+      <w:r>
+        <w:rPr>
+          <w:rFonts w:ascii="Times New Roman" w:hAnsi="Times New Roman" w:cs="Times New Roman"/>
+          <w:b w:val="0"/>
+          <w:i w:val="0"/>
+          <w:color w:val="000000"/>
+        </w:rPr>
+        <w:t xml:space="preserve">A fact sheet on the families who came after 1973, when many workers stayed rather than returned.</w:t>
       </w:r>
     </w:p>
     <w:p>
@@ -299,180 +336,187 @@
       </w:pPr>
       <w:r>
         <w:rPr>
-          <w:rFonts w:ascii="Times New Roman" w:hAnsi="Times New Roman"/>
+          <w:rFonts w:ascii="Times New Roman" w:hAnsi="Times New Roman" w:cs="Times New Roman"/>
           <w:b w:val="0"/>
           <w:i w:val="0"/>
           <w:color w:val="000000"/>
         </w:rPr>
-        <w:t>Four breakout rooms at 13:00, the four one page packs sent to the students in the week before, and a shared screen or document. No prior knowledge of Malta, Jamaica or development economics is assumed; every term is explained in the session. I would be glad to know before the session whether the group has done source criticism in your opening weeks, because that decides between design A and design B.</w:t>
+        <w:t xml:space="preserve">Each group answers the same three questions: what did its side gain, what did it lose, and who set the terms? The whole class then debates who benefited more and who decided. In the next step I ask why the same kind of arrangement would mean something different for a small island like Malta or Jamaica, so that the students work out for themselves what makes the position of a small state different; the discussion draws on the scale of emigration, the number of partners a state can turn to, and two scholarly readings, one that sees dependence (Bertram and Watters 1985) and one that sees bargaining (Katzenstein 1985; Baldacchino 2006). We close with a few minutes on how they would teach this history in German schools, where many pupils have grandparents who came under these agreements, including how a teacher could use family interviews while keeping them optional and respectful.</w:t>
       </w:r>
     </w:p>
     <w:p>
       <w:pPr>
         <w:spacing w:after="80" w:line="264" w:lineRule="auto" w:before="200"/>
+        <w:keepNext/>
       </w:pPr>
       <w:r>
         <w:rPr>
-          <w:rFonts w:ascii="Times New Roman" w:hAnsi="Times New Roman"/>
+          <w:rFonts w:ascii="Times New Roman" w:hAnsi="Times New Roman" w:cs="Times New Roman"/>
           <w:b/>
           <w:i w:val="0"/>
           <w:color w:val="000000"/>
           <w:sz w:val="26"/>
+          <w:szCs w:val="26"/>
         </w:rPr>
-        <w:t>Readings, for students who want them</w:t>
+        <w:t xml:space="preserve">What I would ask of you</w:t>
       </w:r>
     </w:p>
     <w:p>
       <w:pPr>
-        <w:spacing w:after="60" w:line="264" w:lineRule="auto"/>
+        <w:spacing w:after="120" w:line="264" w:lineRule="auto"/>
       </w:pPr>
       <w:r>
         <w:rPr>
-          <w:rFonts w:ascii="Times New Roman" w:hAnsi="Times New Roman"/>
+          <w:rFonts w:ascii="Times New Roman" w:hAnsi="Times New Roman" w:cs="Times New Roman"/>
           <w:b w:val="0"/>
           <w:i w:val="0"/>
           <w:color w:val="000000"/>
         </w:rPr>
-        <w:t xml:space="preserve">Smith, S. C. (2007) Integration and disintegration: the attempted incorporation of Malta into the United Kingdom in the 1950s. Journal of Imperial and Commonwealth History, 35(1), 49 to 71. Open access from the University of Malta library. </w:t>
+        <w:t xml:space="preserve">Three breakout rooms at 13:00 for twelve minutes, and a shared screen. I will send the three one page fact sheets in the week before, so that you can share them with the students if you wish. No prior knowledge of Malta, Jamaica or development economics is assumed, and every term is explained in the session.</w:t>
       </w:r>
-      <w:hyperlink r:id="rId9">
-        <w:r>
-          <w:rPr>
-            <w:u w:val="single"/>
-            <w:rFonts w:ascii="Times New Roman" w:hAnsi="Times New Roman"/>
-          </w:rPr>
-          <w:t xml:space="preserve">https://doi.org/10.1080/03086530601143396</w:t>
-        </w:r>
-      </w:hyperlink>
     </w:p>
     <w:p>
       <w:pPr>
-        <w:spacing w:after="60" w:line="264" w:lineRule="auto"/>
+        <w:spacing w:after="80" w:line="264" w:lineRule="auto" w:before="200"/>
+        <w:keepNext/>
       </w:pPr>
       <w:r>
         <w:rPr>
-          <w:rFonts w:ascii="Times New Roman" w:hAnsi="Times New Roman"/>
+          <w:rFonts w:ascii="Times New Roman" w:hAnsi="Times New Roman" w:cs="Times New Roman"/>
+          <w:b/>
+          <w:i w:val="0"/>
+          <w:color w:val="000000"/>
+          <w:sz w:val="26"/>
+          <w:szCs w:val="26"/>
+        </w:rPr>
+        <w:t xml:space="preserve">Readings, for students who want them</w:t>
+      </w:r>
+    </w:p>
+    <w:p>
+      <w:pPr>
+        <w:spacing w:after="80" w:line="264" w:lineRule="auto"/>
+      </w:pPr>
+      <w:r>
+        <w:rPr>
+          <w:rFonts w:ascii="Times New Roman" w:hAnsi="Times New Roman" w:cs="Times New Roman"/>
           <w:b w:val="0"/>
           <w:i w:val="0"/>
           <w:color w:val="000000"/>
         </w:rPr>
-        <w:t xml:space="preserve">Fenech, D. (1997) Malta's external security. GeoJournal, 41(2), 153 to 163. </w:t>
+        <w:t xml:space="preserve">Smith, S. C. (2007) Integration and disintegration: the attempted incorporation of Malta into the United Kingdom in the 1950s. Journal of Imperial and Commonwealth History, 35(1), 49 to 71. https://doi.org/10.1080/03086530601143396</w:t>
       </w:r>
-      <w:hyperlink r:id="rId10">
-        <w:r>
-          <w:rPr>
-            <w:u w:val="single"/>
-            <w:rFonts w:ascii="Times New Roman" w:hAnsi="Times New Roman"/>
-          </w:rPr>
-          <w:t xml:space="preserve">https://doi.org/10.1023/A:1006888926016</w:t>
-        </w:r>
-      </w:hyperlink>
     </w:p>
     <w:p>
       <w:pPr>
-        <w:spacing w:after="60" w:line="264" w:lineRule="auto"/>
+        <w:spacing w:after="80" w:line="264" w:lineRule="auto"/>
       </w:pPr>
       <w:r>
         <w:rPr>
-          <w:rFonts w:ascii="Times New Roman" w:hAnsi="Times New Roman"/>
+          <w:rFonts w:ascii="Times New Roman" w:hAnsi="Times New Roman" w:cs="Times New Roman"/>
           <w:b w:val="0"/>
           <w:i w:val="0"/>
           <w:color w:val="000000"/>
         </w:rPr>
-        <w:t xml:space="preserve">King, R. (1979) The Maltese migration cycle: an archival survey. Area, 11(3), 245 to 249. </w:t>
+        <w:t xml:space="preserve">Fenech, D. (1997) Malta's external security. GeoJournal, 41(2), 153 to 163. https://doi.org/10.1023/A:1006888926016</w:t>
       </w:r>
-      <w:hyperlink r:id="rId11">
-        <w:r>
-          <w:rPr>
-            <w:u w:val="single"/>
-            <w:rFonts w:ascii="Times New Roman" w:hAnsi="Times New Roman"/>
-          </w:rPr>
-          <w:t xml:space="preserve">https://www.jstor.org/stable/20001477</w:t>
-        </w:r>
-      </w:hyperlink>
     </w:p>
     <w:p>
       <w:pPr>
-        <w:spacing w:after="60" w:line="264" w:lineRule="auto"/>
+        <w:spacing w:after="80" w:line="264" w:lineRule="auto"/>
       </w:pPr>
       <w:r>
         <w:rPr>
-          <w:rFonts w:ascii="Times New Roman" w:hAnsi="Times New Roman"/>
+          <w:rFonts w:ascii="Times New Roman" w:hAnsi="Times New Roman" w:cs="Times New Roman"/>
           <w:b w:val="0"/>
           <w:i w:val="0"/>
           <w:color w:val="000000"/>
         </w:rPr>
-        <w:t xml:space="preserve">Hansen, R. (2000) Citizenship and Immigration in Post-war Britain. Oxford: Oxford University Press. </w:t>
+        <w:t xml:space="preserve">King, R. (1979) The Maltese migration cycle: an archival survey. Area, 11(3), 245 to 249. https://www.jstor.org/stable/20001477</w:t>
       </w:r>
-      <w:hyperlink r:id="rId12">
-        <w:r>
-          <w:rPr>
-            <w:u w:val="single"/>
-            <w:rFonts w:ascii="Times New Roman" w:hAnsi="Times New Roman"/>
-          </w:rPr>
-          <w:t xml:space="preserve">https://doi.org/10.1093/oso/9780198297093.001.0001</w:t>
-        </w:r>
-      </w:hyperlink>
     </w:p>
     <w:p>
       <w:pPr>
-        <w:spacing w:after="60" w:line="264" w:lineRule="auto"/>
+        <w:spacing w:after="80" w:line="264" w:lineRule="auto"/>
       </w:pPr>
       <w:r>
         <w:rPr>
-          <w:rFonts w:ascii="Times New Roman" w:hAnsi="Times New Roman"/>
+          <w:rFonts w:ascii="Times New Roman" w:hAnsi="Times New Roman" w:cs="Times New Roman"/>
           <w:b w:val="0"/>
           <w:i w:val="0"/>
           <w:color w:val="000000"/>
         </w:rPr>
-        <w:t xml:space="preserve">Thomas-Hope, E. (1999) Return migration to Jamaica and its development potential. International Migration, 37(1), 183 to 207. </w:t>
+        <w:t xml:space="preserve">Hansen, R. (2000) Citizenship and Immigration in Post-war Britain. Oxford: Oxford University Press. https://doi.org/10.1093/oso/9780198297093.001.0001</w:t>
       </w:r>
-      <w:hyperlink r:id="rId13">
-        <w:r>
-          <w:rPr>
-            <w:u w:val="single"/>
-            <w:rFonts w:ascii="Times New Roman" w:hAnsi="Times New Roman"/>
-          </w:rPr>
-          <w:t xml:space="preserve">https://doi.org/10.1111/1468-2435.00070</w:t>
-        </w:r>
-      </w:hyperlink>
     </w:p>
     <w:p>
       <w:pPr>
-        <w:spacing w:after="60" w:line="264" w:lineRule="auto"/>
+        <w:spacing w:after="80" w:line="264" w:lineRule="auto"/>
       </w:pPr>
       <w:r>
         <w:rPr>
-          <w:rFonts w:ascii="Times New Roman" w:hAnsi="Times New Roman"/>
+          <w:rFonts w:ascii="Times New Roman" w:hAnsi="Times New Roman" w:cs="Times New Roman"/>
           <w:b w:val="0"/>
           <w:i w:val="0"/>
           <w:color w:val="000000"/>
         </w:rPr>
-        <w:t>Beckles, H. McD. (2013) Britain's Black Debt: reparations for Caribbean slavery and native genocide. Kingston: University of the West Indies Press.</w:t>
+        <w:t xml:space="preserve">Glennie, A. and Chappell, L. (2010) Jamaica: from diverse beginning to diaspora in the developed world. Migration Policy Institute. https://www.migrationpolicy.org/article/jamaica-diverse-beginning-diaspora-developed-world</w:t>
       </w:r>
     </w:p>
     <w:p>
       <w:pPr>
-        <w:spacing w:after="60" w:line="264" w:lineRule="auto"/>
+        <w:spacing w:after="80" w:line="264" w:lineRule="auto"/>
       </w:pPr>
       <w:r>
         <w:rPr>
-          <w:rFonts w:ascii="Times New Roman" w:hAnsi="Times New Roman"/>
+          <w:rFonts w:ascii="Times New Roman" w:hAnsi="Times New Roman" w:cs="Times New Roman"/>
           <w:b w:val="0"/>
           <w:i w:val="0"/>
           <w:color w:val="000000"/>
         </w:rPr>
-        <w:t xml:space="preserve">Baldacchino, G. (2006) Managing the hinterland beyond: two ideal-type strategies of economic development for small island territories. Asia Pacific Viewpoint, 47(1), 45 to 60. </w:t>
+        <w:t xml:space="preserve">Bank of Jamaica (2011) Remittances to Jamaica: findings from a national survey of remittance recipients. https://www.boj.org.jm/uploads/pdf/papers_pamphlets/papers_pamphlets_Remittances_to_Jamaica_-_Findings_from_a_National_Survey_of_Remittance_Recipients.pdf</w:t>
       </w:r>
-      <w:hyperlink r:id="rId14">
-        <w:r>
-          <w:rPr>
-            <w:u w:val="single"/>
-            <w:rFonts w:ascii="Times New Roman" w:hAnsi="Times New Roman"/>
-          </w:rPr>
-          <w:t xml:space="preserve">https://doi.org/10.1111/j.1467-8373.2006.00295.x</w:t>
-        </w:r>
-      </w:hyperlink>
+    </w:p>
+    <w:p>
+      <w:pPr>
+        <w:spacing w:after="80" w:line="264" w:lineRule="auto"/>
+      </w:pPr>
+      <w:r>
+        <w:rPr>
+          <w:rFonts w:ascii="Times New Roman" w:hAnsi="Times New Roman" w:cs="Times New Roman"/>
+          <w:b w:val="0"/>
+          <w:i w:val="0"/>
+          <w:color w:val="000000"/>
+        </w:rPr>
+        <w:t xml:space="preserve">Bundeszentrale für politische Bildung (2020) Erstes Anwerbeabkommen vor 65 Jahren. https://www.bpb.de/kurz-knapp/hintergrund-aktuell/324552/erstes-anwerbeabkommen-vor-65-jahren/</w:t>
+      </w:r>
+    </w:p>
+    <w:p>
+      <w:pPr>
+        <w:spacing w:after="80" w:line="264" w:lineRule="auto"/>
+      </w:pPr>
+      <w:r>
+        <w:rPr>
+          <w:rFonts w:ascii="Times New Roman" w:hAnsi="Times New Roman" w:cs="Times New Roman"/>
+          <w:b w:val="0"/>
+          <w:i w:val="0"/>
+          <w:color w:val="000000"/>
+        </w:rPr>
+        <w:t xml:space="preserve">Bertram, G. and Watters, R. F. (1985) The MIRAB economy in South Pacific microstates. Pacific Viewpoint, 26(3), 497 to 519.</w:t>
+      </w:r>
+    </w:p>
+    <w:p>
+      <w:pPr>
+        <w:spacing w:after="80" w:line="264" w:lineRule="auto"/>
+      </w:pPr>
+      <w:r>
+        <w:rPr>
+          <w:rFonts w:ascii="Times New Roman" w:hAnsi="Times New Roman" w:cs="Times New Roman"/>
+          <w:b w:val="0"/>
+          <w:i w:val="0"/>
+          <w:color w:val="000000"/>
+        </w:rPr>
+        <w:t xml:space="preserve">Baldacchino, G. (2006) Innovative development strategies from non-sovereign island jurisdictions? A global review of economic policy and governance practices. World Development, 34(5), 852 to 867.</w:t>
+      </w:r>
     </w:p>
     <w:sectPr>
       <w:pgSz w:w="12240" w:h="15840"/>

</xml_diff>